<commit_message>
docs(G-02): cerrar gap - crear campañas open/públicas ya funciona (Admin+Marca+Influencer), confirmado con Pri
</commit_message>
<xml_diff>
--- a/SCENCE_FDD_v2.1.docx
+++ b/SCENCE_FDD_v2.1.docx
@@ -16467,33 +16467,133 @@
               <w:jc w:val="left"/>
             </w:pPr>
             <w:r>
+              <w:rPr>
+                <w:strike/>
+              </w:rPr>
               <w:t xml:space="preserve">No hay</w:t>
             </w:r>
             <w:r>
+              <w:rPr>
+                <w:strike/>
+              </w:rPr>
               <w:t xml:space="preserve"> </w:t>
             </w:r>
             <w:r>
               <w:rPr>
                 <w:rStyle w:val="VerbatimChar"/>
+                <w:strike/>
               </w:rPr>
               <w:t xml:space="preserve">/opportunities</w:t>
             </w:r>
             <w:r>
+              <w:rPr>
+                <w:strike/>
+              </w:rPr>
               <w:t xml:space="preserve"> </w:t>
             </w:r>
             <w:r>
-              <w:t xml:space="preserve">dedicado para campañas open</w:t>
-            </w:r>
-          </w:p>
-        </w:tc>
-        <w:tc>
-          <w:p>
-            <w:pPr>
-              <w:pStyle w:val="Compact"/>
-              <w:jc w:val="left"/>
-            </w:pPr>
-            <w:r>
-              <w:t xml:space="preserve">Medio</w:t>
+              <w:rPr>
+                <w:strike/>
+              </w:rPr>
+              <w:t xml:space="preserve">dedicado...</w:t>
+            </w:r>
+            <w:r>
+              <w:t xml:space="preserve"> </w:t>
+            </w:r>
+            <w:r>
+              <w:rPr>
+                <w:b/>
+              </w:rPr>
+              <w:t xml:space="preserve">Resuelto 2026-07-01 (aclarado con Pri):</w:t>
+            </w:r>
+            <w:r>
+              <w:t xml:space="preserve"> </w:t>
+            </w:r>
+            <w:r>
+              <w:t xml:space="preserve">no era un gap real de construcción — crear campañas</w:t>
+            </w:r>
+            <w:r>
+              <w:t xml:space="preserve"> </w:t>
+            </w:r>
+            <w:r>
+              <w:rPr>
+                <w:rStyle w:val="VerbatimChar"/>
+              </w:rPr>
+              <w:t xml:space="preserve">visibility: 'open'</w:t>
+            </w:r>
+            <w:r>
+              <w:t xml:space="preserve"> </w:t>
+            </w:r>
+            <w:r>
+              <w:t xml:space="preserve">ya funciona en Admin (</w:t>
+            </w:r>
+            <w:r>
+              <w:rPr>
+                <w:rStyle w:val="VerbatimChar"/>
+              </w:rPr>
+              <w:t xml:space="preserve">CampaignForm.tsx</w:t>
+            </w:r>
+            <w:r>
+              <w:t xml:space="preserve">) y Marca (</w:t>
+            </w:r>
+            <w:r>
+              <w:rPr>
+                <w:rStyle w:val="VerbatimChar"/>
+              </w:rPr>
+              <w:t xml:space="preserve">CampaignFormView.brand.tsx</w:t>
+            </w:r>
+            <w:r>
+              <w:t xml:space="preserve">, real en</w:t>
+            </w:r>
+            <w:r>
+              <w:t xml:space="preserve"> </w:t>
+            </w:r>
+            <w:r>
+              <w:rPr>
+                <w:rStyle w:val="VerbatimChar"/>
+              </w:rPr>
+              <w:t xml:space="preserve">brand-campaigns/new</w:t>
+            </w:r>
+            <w:r>
+              <w:t xml:space="preserve">), y los influencers de la misma organización ya las ven en</w:t>
+            </w:r>
+            <w:r>
+              <w:t xml:space="preserve"> </w:t>
+            </w:r>
+            <w:r>
+              <w:rPr>
+                <w:rStyle w:val="VerbatimChar"/>
+              </w:rPr>
+              <w:t xml:space="preserve">inf-dash</w:t>
+            </w:r>
+            <w:r>
+              <w:t xml:space="preserve"> </w:t>
+            </w:r>
+            <w:r>
+              <w:t xml:space="preserve">(sección "Campañas Disponibles", vía</w:t>
+            </w:r>
+            <w:r>
+              <w:t xml:space="preserve"> </w:t>
+            </w:r>
+            <w:r>
+              <w:rPr>
+                <w:rStyle w:val="VerbatimChar"/>
+              </w:rPr>
+              <w:t xml:space="preserve">/api/influencer/campaigns/open</w:t>
+            </w:r>
+            <w:r>
+              <w:t xml:space="preserve">) y pueden postular. Abierta = dentro de la organización, no marketplace público entre marcas. Pri confirmó que así está bien, no se necesita página dedicada</w:t>
+            </w:r>
+          </w:p>
+        </w:tc>
+        <w:tc>
+          <w:p>
+            <w:pPr>
+              <w:pStyle w:val="Compact"/>
+              <w:jc w:val="left"/>
+            </w:pPr>
+            <w:r>
+              <w:t xml:space="preserve">Cerrado</w:t>
             </w:r>
           </w:p>
         </w:tc>

</xml_diff>

<commit_message>
fix(B-11): sync influencer_tasks + email de aprobación al aceptar postulación open
- PATCH /api/brand/campaigns/[id]/applications (accept): ahora llama syncDeliverableTask
  por cada campaign_deliverable creado (mismo patrón que /api/campaigns/[id]/influencers)
- Nueva plantilla campaignApplicationApprovedEmail en resend.ts (no reutiliza
  deliverableStatusEmail — son conceptos distintos)
- Encontrado en auditoría end-to-end del flujo open/postulación pedida por Pri
- Cambio acotado solo a ese endpoint, sin tocar RLS/Auth/triggers
</commit_message>
<xml_diff>
--- a/SCENCE_FDD_v2.1.docx
+++ b/SCENCE_FDD_v2.1.docx
@@ -489,6 +489,53 @@
               <w:jc w:val="left"/>
             </w:pPr>
             <w:r>
+              <w:t xml:space="preserve">2.1 (flujo open)</w:t>
+            </w:r>
+          </w:p>
+        </w:tc>
+        <w:tc>
+          <w:p>
+            <w:pPr>
+              <w:pStyle w:val="Compact"/>
+              <w:jc w:val="left"/>
+            </w:pPr>
+            <w:r>
+              <w:t xml:space="preserve">Pri pidió auditar de punta a punta el flujo de campaña pública/open (crear → ver → postular → aprobar → deliverables → tareas → email → visibilidad). Se encontró bug B-11 (faltaba sync de tareas + email al aprobar) y se corrigió, acotado a</w:t>
+            </w:r>
+            <w:r>
+              <w:t xml:space="preserve"> </w:t>
+            </w:r>
+            <w:r>
+              <w:rPr>
+                <w:rStyle w:val="VerbatimChar"/>
+              </w:rPr>
+              <w:t xml:space="preserve">PATCH /api/brand/campaigns/[id]/applications</w:t>
+            </w:r>
+            <w:r>
+              <w:t xml:space="preserve">. Resto del flujo confirmado correcto sin cambios</w:t>
+            </w:r>
+          </w:p>
+        </w:tc>
+        <w:tc>
+          <w:p>
+            <w:pPr>
+              <w:pStyle w:val="Compact"/>
+              <w:jc w:val="left"/>
+            </w:pPr>
+            <w:r>
+              <w:t xml:space="preserve">2026-07-01</w:t>
+            </w:r>
+          </w:p>
+        </w:tc>
+      </w:tr>
+      <w:tr>
+        <w:tc>
+          <w:p>
+            <w:pPr>
+              <w:pStyle w:val="Compact"/>
+              <w:jc w:val="left"/>
+            </w:pPr>
+            <w:r>
               <w:t xml:space="preserve">2.1 (roles)</w:t>
             </w:r>
           </w:p>
@@ -6647,22 +6694,16 @@
               </w:rPr>
               <w:t xml:space="preserve">locations</w:t>
             </w:r>
-            <w:r>
-              <w:t xml:space="preserve"> </w:t>
-            </w:r>
-            <w:r>
-              <w:t xml:space="preserve">(tabla existe)</w:t>
-            </w:r>
-          </w:p>
-        </w:tc>
-        <w:tc>
-          <w:p>
-            <w:pPr>
-              <w:pStyle w:val="Compact"/>
-              <w:jc w:val="left"/>
-            </w:pPr>
-            <w:r>
-              <w:t xml:space="preserve">⚠️ stub sin funcionalidad — G-13</w:t>
+          </w:p>
+        </w:tc>
+        <w:tc>
+          <w:p>
+            <w:pPr>
+              <w:pStyle w:val="Compact"/>
+              <w:jc w:val="left"/>
+            </w:pPr>
+            <w:r>
+              <w:t xml:space="preserve">✅ CRUD completo — ver G-13</w:t>
             </w:r>
           </w:p>
         </w:tc>
@@ -14315,6 +14356,165 @@
           </w:p>
         </w:tc>
       </w:tr>
+      <w:tr>
+        <w:tc>
+          <w:p>
+            <w:pPr>
+              <w:pStyle w:val="Compact"/>
+              <w:jc w:val="left"/>
+            </w:pPr>
+            <w:r>
+              <w:t xml:space="preserve">B-11</w:t>
+            </w:r>
+          </w:p>
+        </w:tc>
+        <w:tc>
+          <w:p>
+            <w:pPr>
+              <w:pStyle w:val="Compact"/>
+              <w:jc w:val="left"/>
+            </w:pPr>
+            <w:r>
+              <w:t xml:space="preserve">🟡 Media</w:t>
+            </w:r>
+          </w:p>
+        </w:tc>
+        <w:tc>
+          <w:p>
+            <w:pPr>
+              <w:pStyle w:val="Compact"/>
+              <w:jc w:val="left"/>
+            </w:pPr>
+            <w:r>
+              <w:t xml:space="preserve">Influencer</w:t>
+            </w:r>
+          </w:p>
+        </w:tc>
+        <w:tc>
+          <w:p>
+            <w:pPr>
+              <w:pStyle w:val="Compact"/>
+              <w:jc w:val="left"/>
+            </w:pPr>
+            <w:r>
+              <w:t xml:space="preserve">Al aprobar una postulación a campaña open (</w:t>
+            </w:r>
+            <w:r>
+              <w:rPr>
+                <w:rStyle w:val="VerbatimChar"/>
+              </w:rPr>
+              <w:t xml:space="preserve">PATCH /api/brand/campaigns/[id]/applications</w:t>
+            </w:r>
+            <w:r>
+              <w:t xml:space="preserve">,</w:t>
+            </w:r>
+            <w:r>
+              <w:t xml:space="preserve"> </w:t>
+            </w:r>
+            <w:r>
+              <w:rPr>
+                <w:rStyle w:val="VerbatimChar"/>
+              </w:rPr>
+              <w:t xml:space="preserve">action=accept</w:t>
+            </w:r>
+            <w:r>
+              <w:t xml:space="preserve">), se creaban los</w:t>
+            </w:r>
+            <w:r>
+              <w:t xml:space="preserve"> </w:t>
+            </w:r>
+            <w:r>
+              <w:rPr>
+                <w:rStyle w:val="VerbatimChar"/>
+              </w:rPr>
+              <w:t xml:space="preserve">campaign_deliverables</w:t>
+            </w:r>
+            <w:r>
+              <w:t xml:space="preserve"> </w:t>
+            </w:r>
+            <w:r>
+              <w:t xml:space="preserve">reales pero nunca se llamaba a</w:t>
+            </w:r>
+            <w:r>
+              <w:t xml:space="preserve"> </w:t>
+            </w:r>
+            <w:r>
+              <w:rPr>
+                <w:rStyle w:val="VerbatimChar"/>
+              </w:rPr>
+              <w:t xml:space="preserve">syncDeliverableTask</w:t>
+            </w:r>
+            <w:r>
+              <w:t xml:space="preserve"> </w:t>
+            </w:r>
+            <w:r>
+              <w:t xml:space="preserve">— el influencer no veía la tarea en "Mis tareas" pese a tener un deliverable real asignado. Es el gap inverso a B-10 (faltaban tareas reales, no sobraban fantasma). Tampoco se enviaba ningún email al aprobar</w:t>
+            </w:r>
+          </w:p>
+        </w:tc>
+        <w:tc>
+          <w:p>
+            <w:pPr>
+              <w:pStyle w:val="Compact"/>
+              <w:jc w:val="left"/>
+            </w:pPr>
+            <w:r>
+              <w:t xml:space="preserve">✅ Corregido — encontrado en auditoría del flujo open/postulación pedida por Pri (2026-07-01). Se agregó el</w:t>
+            </w:r>
+            <w:r>
+              <w:t xml:space="preserve"> </w:t>
+            </w:r>
+            <w:r>
+              <w:rPr>
+                <w:rStyle w:val="VerbatimChar"/>
+              </w:rPr>
+              <w:t xml:space="preserve">syncDeliverableTask</w:t>
+            </w:r>
+            <w:r>
+              <w:t xml:space="preserve"> </w:t>
+            </w:r>
+            <w:r>
+              <w:t xml:space="preserve">por cada deliverable creado y un email de aprobación (</w:t>
+            </w:r>
+            <w:r>
+              <w:rPr>
+                <w:rStyle w:val="VerbatimChar"/>
+              </w:rPr>
+              <w:t xml:space="preserve">campaignApplicationApprovedEmail</w:t>
+            </w:r>
+            <w:r>
+              <w:t xml:space="preserve">, plantilla nueva en</w:t>
+            </w:r>
+            <w:r>
+              <w:t xml:space="preserve"> </w:t>
+            </w:r>
+            <w:r>
+              <w:rPr>
+                <w:rStyle w:val="VerbatimChar"/>
+              </w:rPr>
+              <w:t xml:space="preserve">resend.ts</w:t>
+            </w:r>
+            <w:r>
+              <w:t xml:space="preserve">, no reutiliza</w:t>
+            </w:r>
+            <w:r>
+              <w:t xml:space="preserve"> </w:t>
+            </w:r>
+            <w:r>
+              <w:rPr>
+                <w:rStyle w:val="VerbatimChar"/>
+              </w:rPr>
+              <w:t xml:space="preserve">deliverableStatusEmail</w:t>
+            </w:r>
+            <w:r>
+              <w:t xml:space="preserve"> </w:t>
+            </w:r>
+            <w:r>
+              <w:t xml:space="preserve">porque ese es para estado de contenido ya enviado, no para aprobación de participación)</w:t>
+            </w:r>
+          </w:p>
+        </w:tc>
+      </w:tr>
     </w:tbl>
     <w:p>
       <w:pPr>
@@ -16872,7 +17072,25 @@
               <w:jc w:val="left"/>
             </w:pPr>
             <w:r>
-              <w:t xml:space="preserve">Configuración → Lugares es un stub sin funcionalidad, pese a que la tabla</w:t>
+              <w:rPr>
+                <w:strike/>
+              </w:rPr>
+              <w:t xml:space="preserve">Configuración → Lugares es un stub...</w:t>
+            </w:r>
+            <w:r>
+              <w:t xml:space="preserve"> </w:t>
+            </w:r>
+            <w:r>
+              <w:rPr>
+                <w:b/>
+              </w:rPr>
+              <w:t xml:space="preserve">Resuelto 2026-07-01:</w:t>
+            </w:r>
+            <w:r>
+              <w:t xml:space="preserve"> </w:t>
+            </w:r>
+            <w:r>
+              <w:t xml:space="preserve">la tabla</w:t>
             </w:r>
             <w:r>
               <w:t xml:space="preserve"> </w:t>
@@ -16887,18 +17105,69 @@
               <w:t xml:space="preserve"> </w:t>
             </w:r>
             <w:r>
-              <w:t xml:space="preserve">ya existe y se usa en campañas/marcas</w:t>
-            </w:r>
-          </w:p>
-        </w:tc>
-        <w:tc>
-          <w:p>
-            <w:pPr>
-              <w:pStyle w:val="Compact"/>
-              <w:jc w:val="left"/>
-            </w:pPr>
-            <w:r>
-              <w:t xml:space="preserve">Bajo</w:t>
+              <w:t xml:space="preserve">existía (RLS incluida) pero 0 endpoints la usaban — no era "conectar UI a API existente" como se pensó al inicio, había que construir el API completo. Se construyó</w:t>
+            </w:r>
+            <w:r>
+              <w:t xml:space="preserve"> </w:t>
+            </w:r>
+            <w:r>
+              <w:rPr>
+                <w:rStyle w:val="VerbatimChar"/>
+              </w:rPr>
+              <w:t xml:space="preserve">GET/POST /api/locations</w:t>
+            </w:r>
+            <w:r>
+              <w:t xml:space="preserve"> </w:t>
+            </w:r>
+            <w:r>
+              <w:t xml:space="preserve">+</w:t>
+            </w:r>
+            <w:r>
+              <w:t xml:space="preserve"> </w:t>
+            </w:r>
+            <w:r>
+              <w:rPr>
+                <w:rStyle w:val="VerbatimChar"/>
+              </w:rPr>
+              <w:t xml:space="preserve">PATCH/DELETE /api/locations/[id]</w:t>
+            </w:r>
+            <w:r>
+              <w:t xml:space="preserve"> </w:t>
+            </w:r>
+            <w:r>
+              <w:t xml:space="preserve">(org-scoped, solo</w:t>
+            </w:r>
+            <w:r>
+              <w:t xml:space="preserve"> </w:t>
+            </w:r>
+            <w:r>
+              <w:rPr>
+                <w:rStyle w:val="VerbatimChar"/>
+              </w:rPr>
+              <w:t xml:space="preserve">super_admin</w:t>
+            </w:r>
+            <w:r>
+              <w:t xml:space="preserve">) y la UI (lista + modal crear/editar + borrar) en</w:t>
+            </w:r>
+            <w:r>
+              <w:t xml:space="preserve"> </w:t>
+            </w:r>
+            <w:r>
+              <w:rPr>
+                <w:rStyle w:val="VerbatimChar"/>
+              </w:rPr>
+              <w:t xml:space="preserve">admin-settings/locations</w:t>
+            </w:r>
+          </w:p>
+        </w:tc>
+        <w:tc>
+          <w:p>
+            <w:pPr>
+              <w:pStyle w:val="Compact"/>
+              <w:jc w:val="left"/>
+            </w:pPr>
+            <w:r>
+              <w:t xml:space="preserve">Cerrado</w:t>
             </w:r>
           </w:p>
         </w:tc>

</xml_diff>